<commit_message>
Sync local site: remove bundle feature, add dev generators and CLAUDE.md, update docs
Local working copy is newer than the July 21 push — the All-Undrafted
bundle was removed from the explainer, demo, and FAQ, and the doc
binaries were regenerated. Adds the dev/ generator scripts and the
handoff CLAUDE.md so the repo is the full source of truth.

Co-Authored-By: Claude Fable 5 <noreply@anthropic.com>
</commit_message>
<xml_diff>
--- a/docs/Bawse League - Official Rulebook.docx
+++ b/docs/Bawse League - Official Rulebook.docx
@@ -45,7 +45,7 @@
           <w:sz w:val="20"/>
           <w:szCs w:val="20"/>
         </w:rPr>
-        <w:t xml:space="preserve">Version 1.0 — Draft for league ratification • July 2026</w:t>
+        <w:t xml:space="preserve">Version 1.1 — Draft for league ratification • July 2026</w:t>
       </w:r>
     </w:p>
     <w:p>
@@ -644,59 +644,46 @@
         <w:pStyle w:val="Heading1"/>
       </w:pPr>
       <w:r>
-        <w:t xml:space="preserve">5. The “All Undrafted” Pick</w:t>
-      </w:r>
-    </w:p>
-    <w:p>
-      <w:pPr>
-        <w:pStyle w:val="ListParagraph"/>
-        <w:numPr>
-          <w:ilvl w:val="0"/>
-          <w:numId w:val="2"/>
-        </w:numPr>
-        <w:spacing w:after="100"/>
-      </w:pPr>
-      <w:r>
-        <w:t xml:space="preserve">With any pick, a manager may select “All Undrafted — [League]” for exactly one of the seven leagues. At the end of the draft, that manager owns every team in that league that no one drafted individually.</w:t>
-      </w:r>
-    </w:p>
-    <w:p>
-      <w:pPr>
-        <w:pStyle w:val="ListParagraph"/>
-        <w:numPr>
-          <w:ilvl w:val="0"/>
-          <w:numId w:val="2"/>
-        </w:numPr>
-        <w:spacing w:after="100"/>
-      </w:pPr>
-      <w:r>
-        <w:t xml:space="preserve">Each league’s “All Undrafted” bundle may only be taken once per draft, and a single manager may hold at most two bundles.</w:t>
-      </w:r>
-    </w:p>
-    <w:p>
-      <w:pPr>
-        <w:pStyle w:val="ListParagraph"/>
-        <w:numPr>
-          <w:ilvl w:val="0"/>
-          <w:numId w:val="2"/>
-        </w:numPr>
-        <w:spacing w:after="100"/>
-      </w:pPr>
-      <w:r>
-        <w:t xml:space="preserve">The bundle occupies one roster spot, no matter how many teams end up in it.</w:t>
-      </w:r>
-    </w:p>
-    <w:p>
-      <w:pPr>
-        <w:pStyle w:val="ListParagraph"/>
-        <w:numPr>
-          <w:ilvl w:val="0"/>
-          <w:numId w:val="2"/>
-        </w:numPr>
-        <w:spacing w:after="100"/>
-      </w:pPr>
-      <w:r>
-        <w:t xml:space="preserve">Teams individually drafted after the bundle is picked are removed from the bundle. Moaning and groaning by the bundle-holder is expected and encouraged.</w:t>
+        <w:t xml:space="preserve">5. Rosters and Ownership</w:t>
+      </w:r>
+    </w:p>
+    <w:p>
+      <w:pPr>
+        <w:pStyle w:val="ListParagraph"/>
+        <w:numPr>
+          <w:ilvl w:val="0"/>
+          <w:numId w:val="2"/>
+        </w:numPr>
+        <w:spacing w:after="100"/>
+      </w:pPr>
+      <w:r>
+        <w:t xml:space="preserve">Rosters lock at the end of the draft. There are no waivers, free agency, or pickups of any kind during the season. Teams nobody drafted simply stay unowned for the league year.</w:t>
+      </w:r>
+    </w:p>
+    <w:p>
+      <w:pPr>
+        <w:pStyle w:val="ListParagraph"/>
+        <w:numPr>
+          <w:ilvl w:val="0"/>
+          <w:numId w:val="2"/>
+        </w:numPr>
+        <w:spacing w:after="100"/>
+      </w:pPr>
+      <w:r>
+        <w:t xml:space="preserve">You own the team, not the players. Trades, firings, injuries, and scandals within a real-life team are your problem and everyone else’s entertainment.</w:t>
+      </w:r>
+    </w:p>
+    <w:p>
+      <w:pPr>
+        <w:pStyle w:val="ListParagraph"/>
+        <w:numPr>
+          <w:ilvl w:val="0"/>
+          <w:numId w:val="2"/>
+        </w:numPr>
+        <w:spacing w:after="100"/>
+      </w:pPr>
+      <w:r>
+        <w:t xml:space="preserve">If a real-life team relocates or renames mid-season, ownership follows the franchise.</w:t>
       </w:r>
     </w:p>
     <w:p>
@@ -717,46 +704,46 @@
         <w:pStyle w:val="Heading1"/>
       </w:pPr>
       <w:r>
-        <w:t xml:space="preserve">6. Rosters and Ownership</w:t>
-      </w:r>
-    </w:p>
-    <w:p>
-      <w:pPr>
-        <w:pStyle w:val="ListParagraph"/>
-        <w:numPr>
-          <w:ilvl w:val="0"/>
-          <w:numId w:val="2"/>
-        </w:numPr>
-        <w:spacing w:after="100"/>
-      </w:pPr>
-      <w:r>
-        <w:t xml:space="preserve">Rosters lock at the end of the draft. There are no waivers, free agency, or pickups of any kind during the season. Every championship-eligible team is owned by someone — that’s the point of Section 5.</w:t>
-      </w:r>
-    </w:p>
-    <w:p>
-      <w:pPr>
-        <w:pStyle w:val="ListParagraph"/>
-        <w:numPr>
-          <w:ilvl w:val="0"/>
-          <w:numId w:val="2"/>
-        </w:numPr>
-        <w:spacing w:after="100"/>
-      </w:pPr>
-      <w:r>
-        <w:t xml:space="preserve">You own the team, not the players. Trades, firings, injuries, and scandals within a real-life team are your problem and everyone else’s entertainment.</w:t>
-      </w:r>
-    </w:p>
-    <w:p>
-      <w:pPr>
-        <w:pStyle w:val="ListParagraph"/>
-        <w:numPr>
-          <w:ilvl w:val="0"/>
-          <w:numId w:val="2"/>
-        </w:numPr>
-        <w:spacing w:after="100"/>
-      </w:pPr>
-      <w:r>
-        <w:t xml:space="preserve">If a real-life team relocates or renames mid-season, ownership follows the franchise.</w:t>
+        <w:t xml:space="preserve">6. Trades</w:t>
+      </w:r>
+    </w:p>
+    <w:p>
+      <w:pPr>
+        <w:pStyle w:val="ListParagraph"/>
+        <w:numPr>
+          <w:ilvl w:val="0"/>
+          <w:numId w:val="2"/>
+        </w:numPr>
+        <w:spacing w:after="100"/>
+      </w:pPr>
+      <w:r>
+        <w:t xml:space="preserve">Trades between managers are open from the end of the draft until each involved team’s championship is decided. Yes, you can trade a team during its championship series — that’s where legends are made.</w:t>
+      </w:r>
+    </w:p>
+    <w:p>
+      <w:pPr>
+        <w:pStyle w:val="ListParagraph"/>
+        <w:numPr>
+          <w:ilvl w:val="0"/>
+          <w:numId w:val="2"/>
+        </w:numPr>
+        <w:spacing w:after="100"/>
+      </w:pPr>
+      <w:r>
+        <w:t xml:space="preserve">Trades may involve any number of teams on either side. Side agreements involving future draft position are allowed if announced publicly; cash considerations are not.</w:t>
+      </w:r>
+    </w:p>
+    <w:p>
+      <w:pPr>
+        <w:pStyle w:val="ListParagraph"/>
+        <w:numPr>
+          <w:ilvl w:val="0"/>
+          <w:numId w:val="2"/>
+        </w:numPr>
+        <w:spacing w:after="100"/>
+      </w:pPr>
+      <w:r>
+        <w:t xml:space="preserve">A trade is official when both managers confirm it in the group chat and the Commissioner logs it on the sheet. No vetoes — lopsided trades are content.</w:t>
       </w:r>
     </w:p>
     <w:p>
@@ -764,46 +751,72 @@
         <w:pStyle w:val="Heading1"/>
       </w:pPr>
       <w:r>
-        <w:t xml:space="preserve">7. Trades</w:t>
-      </w:r>
-    </w:p>
-    <w:p>
-      <w:pPr>
-        <w:pStyle w:val="ListParagraph"/>
-        <w:numPr>
-          <w:ilvl w:val="0"/>
-          <w:numId w:val="2"/>
-        </w:numPr>
-        <w:spacing w:after="100"/>
-      </w:pPr>
-      <w:r>
-        <w:t xml:space="preserve">Trades between managers are open from the end of the draft until each involved team’s championship is decided. Yes, you can trade a team during its championship series — that’s where legends are made.</w:t>
-      </w:r>
-    </w:p>
-    <w:p>
-      <w:pPr>
-        <w:pStyle w:val="ListParagraph"/>
-        <w:numPr>
-          <w:ilvl w:val="0"/>
-          <w:numId w:val="2"/>
-        </w:numPr>
-        <w:spacing w:after="100"/>
-      </w:pPr>
-      <w:r>
-        <w:t xml:space="preserve">Trades may involve any number of teams on either side, including “All Undrafted” bundles (traded whole). Side agreements involving future draft position are allowed if announced publicly; cash considerations are not.</w:t>
-      </w:r>
-    </w:p>
-    <w:p>
-      <w:pPr>
-        <w:pStyle w:val="ListParagraph"/>
-        <w:numPr>
-          <w:ilvl w:val="0"/>
-          <w:numId w:val="2"/>
-        </w:numPr>
-        <w:spacing w:after="100"/>
-      </w:pPr>
-      <w:r>
-        <w:t xml:space="preserve">A trade is official when both managers confirm it in the group chat and the Commissioner logs it on the sheet. No vetoes — lopsided trades are content.</w:t>
+        <w:t xml:space="preserve">7. Payouts</w:t>
+      </w:r>
+    </w:p>
+    <w:p>
+      <w:pPr>
+        <w:pStyle w:val="ListParagraph"/>
+        <w:numPr>
+          <w:ilvl w:val="0"/>
+          <w:numId w:val="2"/>
+        </w:numPr>
+        <w:spacing w:after="100"/>
+      </w:pPr>
+      <w:r>
+        <w:t xml:space="preserve">The prize pool is divided into seven equal shares — one per championship.</w:t>
+      </w:r>
+    </w:p>
+    <w:p>
+      <w:pPr>
+        <w:pStyle w:val="ListParagraph"/>
+        <w:numPr>
+          <w:ilvl w:val="0"/>
+          <w:numId w:val="2"/>
+        </w:numPr>
+        <w:spacing w:after="100"/>
+      </w:pPr>
+      <w:r>
+        <w:t xml:space="preserve">When a championship is won, the manager who owns that team (at the moment the title is decided) collects that share immediately. One manager can win multiple shares.</w:t>
+      </w:r>
+    </w:p>
+    <w:p>
+      <w:pPr>
+        <w:pStyle w:val="ListParagraph"/>
+        <w:numPr>
+          <w:ilvl w:val="0"/>
+          <w:numId w:val="2"/>
+        </w:numPr>
+        <w:spacing w:after="100"/>
+      </w:pPr>
+      <w:r>
+        <w:t xml:space="preserve">If a championship is won by a team no manager owns, that share rolls over into the next season’s prize pool.</w:t>
+      </w:r>
+    </w:p>
+    <w:p>
+      <w:pPr>
+        <w:pStyle w:val="ListParagraph"/>
+        <w:numPr>
+          <w:ilvl w:val="0"/>
+          <w:numId w:val="2"/>
+        </w:numPr>
+        <w:spacing w:after="100"/>
+      </w:pPr>
+      <w:r>
+        <w:t xml:space="preserve">If a competition fails to crown a champion (lockout, cancellation), that share is refunded to all managers equally.</w:t>
+      </w:r>
+    </w:p>
+    <w:p>
+      <w:pPr>
+        <w:pStyle w:val="ListParagraph"/>
+        <w:numPr>
+          <w:ilvl w:val="0"/>
+          <w:numId w:val="2"/>
+        </w:numPr>
+        <w:spacing w:after="100"/>
+      </w:pPr>
+      <w:r>
+        <w:t xml:space="preserve">If a title is vacated after the fact, the payout stands as awarded on the night. We are not litigating the NCAA’s paperwork.</w:t>
       </w:r>
     </w:p>
     <w:p>
@@ -811,59 +824,46 @@
         <w:pStyle w:val="Heading1"/>
       </w:pPr>
       <w:r>
-        <w:t xml:space="preserve">8. Payouts</w:t>
-      </w:r>
-    </w:p>
-    <w:p>
-      <w:pPr>
-        <w:pStyle w:val="ListParagraph"/>
-        <w:numPr>
-          <w:ilvl w:val="0"/>
-          <w:numId w:val="2"/>
-        </w:numPr>
-        <w:spacing w:after="100"/>
-      </w:pPr>
-      <w:r>
-        <w:t xml:space="preserve">The prize pool is divided into seven equal shares — one per championship.</w:t>
-      </w:r>
-    </w:p>
-    <w:p>
-      <w:pPr>
-        <w:pStyle w:val="ListParagraph"/>
-        <w:numPr>
-          <w:ilvl w:val="0"/>
-          <w:numId w:val="2"/>
-        </w:numPr>
-        <w:spacing w:after="100"/>
-      </w:pPr>
-      <w:r>
-        <w:t xml:space="preserve">When a championship is won, the manager who owns that team (at the moment the title is decided) collects that share immediately. One manager can win multiple shares.</w:t>
-      </w:r>
-    </w:p>
-    <w:p>
-      <w:pPr>
-        <w:pStyle w:val="ListParagraph"/>
-        <w:numPr>
-          <w:ilvl w:val="0"/>
-          <w:numId w:val="2"/>
-        </w:numPr>
-        <w:spacing w:after="100"/>
-      </w:pPr>
-      <w:r>
-        <w:t xml:space="preserve">If a competition fails to crown a champion (lockout, cancellation), that share is refunded to all managers equally.</w:t>
-      </w:r>
-    </w:p>
-    <w:p>
-      <w:pPr>
-        <w:pStyle w:val="ListParagraph"/>
-        <w:numPr>
-          <w:ilvl w:val="0"/>
-          <w:numId w:val="2"/>
-        </w:numPr>
-        <w:spacing w:after="100"/>
-      </w:pPr>
-      <w:r>
-        <w:t xml:space="preserve">If a title is vacated after the fact, the payout stands as awarded on the night. We are not litigating the NCAA’s paperwork.</w:t>
+        <w:t xml:space="preserve">8. The Shot Rule</w:t>
+      </w:r>
+    </w:p>
+    <w:p>
+      <w:pPr>
+        <w:pStyle w:val="ListParagraph"/>
+        <w:numPr>
+          <w:ilvl w:val="0"/>
+          <w:numId w:val="2"/>
+        </w:numPr>
+        <w:spacing w:after="100"/>
+      </w:pPr>
+      <w:r>
+        <w:t xml:space="preserve">When a manager’s last remaining team in any league is mathematically eliminated from (or loses) that league’s championship, they owe the group chat a video of themselves taking a shot within 48 hours.</w:t>
+      </w:r>
+    </w:p>
+    <w:p>
+      <w:pPr>
+        <w:pStyle w:val="ListParagraph"/>
+        <w:numPr>
+          <w:ilvl w:val="0"/>
+          <w:numId w:val="2"/>
+        </w:numPr>
+        <w:spacing w:after="100"/>
+      </w:pPr>
+      <w:r>
+        <w:t xml:space="preserve">Non-drinkers may substitute an equivalently undignified forfeit approved by league vote (hot sauce is the traditional alternative).</w:t>
+      </w:r>
+    </w:p>
+    <w:p>
+      <w:pPr>
+        <w:pStyle w:val="ListParagraph"/>
+        <w:numPr>
+          <w:ilvl w:val="0"/>
+          <w:numId w:val="2"/>
+        </w:numPr>
+        <w:spacing w:after="100"/>
+      </w:pPr>
+      <w:r>
+        <w:t xml:space="preserve">The shot rule is social glue, not law. Chronic non-compliance is punishable by group-chat roasting only.</w:t>
       </w:r>
     </w:p>
     <w:p>
@@ -871,46 +871,46 @@
         <w:pStyle w:val="Heading1"/>
       </w:pPr>
       <w:r>
-        <w:t xml:space="preserve">9. The Shot Rule</w:t>
-      </w:r>
-    </w:p>
-    <w:p>
-      <w:pPr>
-        <w:pStyle w:val="ListParagraph"/>
-        <w:numPr>
-          <w:ilvl w:val="0"/>
-          <w:numId w:val="2"/>
-        </w:numPr>
-        <w:spacing w:after="100"/>
-      </w:pPr>
-      <w:r>
-        <w:t xml:space="preserve">When a manager’s last remaining team in any league is mathematically eliminated from (or loses) that league’s championship, they owe the group chat a video of themselves taking a shot within 48 hours.</w:t>
-      </w:r>
-    </w:p>
-    <w:p>
-      <w:pPr>
-        <w:pStyle w:val="ListParagraph"/>
-        <w:numPr>
-          <w:ilvl w:val="0"/>
-          <w:numId w:val="2"/>
-        </w:numPr>
-        <w:spacing w:after="100"/>
-      </w:pPr>
-      <w:r>
-        <w:t xml:space="preserve">Non-drinkers may substitute an equivalently undignified forfeit approved by league vote (hot sauce is the traditional alternative).</w:t>
-      </w:r>
-    </w:p>
-    <w:p>
-      <w:pPr>
-        <w:pStyle w:val="ListParagraph"/>
-        <w:numPr>
-          <w:ilvl w:val="0"/>
-          <w:numId w:val="2"/>
-        </w:numPr>
-        <w:spacing w:after="100"/>
-      </w:pPr>
-      <w:r>
-        <w:t xml:space="preserve">The shot rule is social glue, not law. Chronic non-compliance is punishable by group-chat roasting only.</w:t>
+        <w:t xml:space="preserve">9. Edge Cases and Rulings</w:t>
+      </w:r>
+    </w:p>
+    <w:p>
+      <w:pPr>
+        <w:pStyle w:val="ListParagraph"/>
+        <w:numPr>
+          <w:ilvl w:val="0"/>
+          <w:numId w:val="2"/>
+        </w:numPr>
+        <w:spacing w:after="100"/>
+      </w:pPr>
+      <w:r>
+        <w:t xml:space="preserve">EPL relegation: a drafted club relegated during the league year is simply dead weight — it stays on the roster. The Master Team List for the next draft reflects the new 20-club Premier League.</w:t>
+      </w:r>
+    </w:p>
+    <w:p>
+      <w:pPr>
+        <w:pStyle w:val="ListParagraph"/>
+        <w:numPr>
+          <w:ilvl w:val="0"/>
+          <w:numId w:val="2"/>
+        </w:numPr>
+        <w:spacing w:after="100"/>
+      </w:pPr>
+      <w:r>
+        <w:t xml:space="preserve">If two owned teams meet in a final, the shot rule and payouts resolve per team, not per manager.</w:t>
+      </w:r>
+    </w:p>
+    <w:p>
+      <w:pPr>
+        <w:pStyle w:val="ListParagraph"/>
+        <w:numPr>
+          <w:ilvl w:val="0"/>
+          <w:numId w:val="2"/>
+        </w:numPr>
+        <w:spacing w:after="100"/>
+      </w:pPr>
+      <w:r>
+        <w:t xml:space="preserve">Anything not covered here is resolved by Commissioner ruling, subject to override by a 7-of-10 league vote.</w:t>
       </w:r>
     </w:p>
     <w:p>
@@ -918,54 +918,7 @@
         <w:pStyle w:val="Heading1"/>
       </w:pPr>
       <w:r>
-        <w:t xml:space="preserve">10. Edge Cases and Rulings</w:t>
-      </w:r>
-    </w:p>
-    <w:p>
-      <w:pPr>
-        <w:pStyle w:val="ListParagraph"/>
-        <w:numPr>
-          <w:ilvl w:val="0"/>
-          <w:numId w:val="2"/>
-        </w:numPr>
-        <w:spacing w:after="100"/>
-      </w:pPr>
-      <w:r>
-        <w:t xml:space="preserve">EPL relegation: a drafted club relegated during the league year is simply dead weight — it stays on the roster. The Master Team List for the next draft reflects the new 20-club Premier League.</w:t>
-      </w:r>
-    </w:p>
-    <w:p>
-      <w:pPr>
-        <w:pStyle w:val="ListParagraph"/>
-        <w:numPr>
-          <w:ilvl w:val="0"/>
-          <w:numId w:val="2"/>
-        </w:numPr>
-        <w:spacing w:after="100"/>
-      </w:pPr>
-      <w:r>
-        <w:t xml:space="preserve">If two owned teams meet in a final, the shot rule and payouts resolve per team, not per manager.</w:t>
-      </w:r>
-    </w:p>
-    <w:p>
-      <w:pPr>
-        <w:pStyle w:val="ListParagraph"/>
-        <w:numPr>
-          <w:ilvl w:val="0"/>
-          <w:numId w:val="2"/>
-        </w:numPr>
-        <w:spacing w:after="100"/>
-      </w:pPr>
-      <w:r>
-        <w:t xml:space="preserve">Anything not covered here is resolved by Commissioner ruling, subject to override by a 7-of-10 league vote.</w:t>
-      </w:r>
-    </w:p>
-    <w:p>
-      <w:pPr>
-        <w:pStyle w:val="Heading1"/>
-      </w:pPr>
-      <w:r>
-        <w:t xml:space="preserve">11. Commissioner and Amendments</w:t>
+        <w:t xml:space="preserve">10. Commissioner and Amendments</w:t>
       </w:r>
     </w:p>
     <w:p>

</xml_diff>